<commit_message>
Updated manual test plan
</commit_message>
<xml_diff>
--- a/Manual Test Plan.docx
+++ b/Manual Test Plan.docx
@@ -31,17 +31,6 @@
         <w:jc w:val="center"/>
         <w:rPr>
           <w:rFonts w:ascii="Calibri" w:hAnsi="Calibri" w:cs="Calibri"/>
-          <w:sz w:val="24"/>
-          <w:szCs w:val="24"/>
-        </w:rPr>
-      </w:pPr>
-    </w:p>
-    <w:p>
-      <w:pPr>
-        <w:spacing w:after="0"/>
-        <w:jc w:val="center"/>
-        <w:rPr>
-          <w:rFonts w:ascii="Calibri" w:hAnsi="Calibri" w:cs="Calibri"/>
           <w:b/>
           <w:bCs/>
           <w:sz w:val="24"/>
@@ -763,25 +752,25 @@
           <w:sz w:val="24"/>
           <w:szCs w:val="24"/>
         </w:rPr>
+        <w:t>- Subtotal = 600</w:t>
+      </w:r>
+    </w:p>
+    <w:p>
+      <w:pPr>
+        <w:spacing w:after="0"/>
+        <w:rPr>
+          <w:rFonts w:ascii="Calibri" w:hAnsi="Calibri" w:cs="Calibri"/>
+          <w:sz w:val="24"/>
+          <w:szCs w:val="24"/>
+        </w:rPr>
+      </w:pPr>
+      <w:r>
+        <w:rPr>
+          <w:rFonts w:ascii="Calibri" w:hAnsi="Calibri" w:cs="Calibri"/>
+          <w:sz w:val="24"/>
+          <w:szCs w:val="24"/>
+        </w:rPr>
         <w:lastRenderedPageBreak/>
-        <w:t>- Subtotal = 600</w:t>
-      </w:r>
-    </w:p>
-    <w:p>
-      <w:pPr>
-        <w:spacing w:after="0"/>
-        <w:rPr>
-          <w:rFonts w:ascii="Calibri" w:hAnsi="Calibri" w:cs="Calibri"/>
-          <w:sz w:val="24"/>
-          <w:szCs w:val="24"/>
-        </w:rPr>
-      </w:pPr>
-      <w:r>
-        <w:rPr>
-          <w:rFonts w:ascii="Calibri" w:hAnsi="Calibri" w:cs="Calibri"/>
-          <w:sz w:val="24"/>
-          <w:szCs w:val="24"/>
-        </w:rPr>
         <w:t>- 10% discount applied</w:t>
       </w:r>
     </w:p>
@@ -864,15 +853,7 @@
           <w:sz w:val="24"/>
           <w:szCs w:val="24"/>
         </w:rPr>
-        <w:t xml:space="preserve">Test Result </w:t>
-      </w:r>
-      <w:r>
-        <w:rPr>
-          <w:rFonts w:ascii="Calibri" w:hAnsi="Calibri" w:cs="Calibri"/>
-          <w:sz w:val="24"/>
-          <w:szCs w:val="24"/>
-        </w:rPr>
-        <w:t>Pass</w:t>
+        <w:t>Test Result Pass</w:t>
       </w:r>
     </w:p>
     <w:p>
@@ -2316,6 +2297,62 @@
           <w:szCs w:val="24"/>
         </w:rPr>
         <w:t>All test cases were executed successfully. The application correctly applies discounts, validates input, classifies orders, performs LINQ operations, and retrieves products using a generic method. All assignment requirements were met.</w:t>
+      </w:r>
+    </w:p>
+    <w:p>
+      <w:pPr>
+        <w:spacing w:after="0"/>
+        <w:rPr>
+          <w:rFonts w:ascii="Calibri" w:hAnsi="Calibri" w:cs="Calibri"/>
+          <w:sz w:val="24"/>
+          <w:szCs w:val="24"/>
+        </w:rPr>
+      </w:pPr>
+    </w:p>
+    <w:p>
+      <w:pPr>
+        <w:spacing w:after="0"/>
+        <w:rPr>
+          <w:rFonts w:ascii="Calibri" w:hAnsi="Calibri" w:cs="Calibri"/>
+          <w:sz w:val="24"/>
+          <w:szCs w:val="24"/>
+        </w:rPr>
+      </w:pPr>
+    </w:p>
+    <w:p>
+      <w:pPr>
+        <w:spacing w:after="0"/>
+        <w:rPr>
+          <w:rFonts w:ascii="Calibri" w:hAnsi="Calibri" w:cs="Calibri"/>
+          <w:sz w:val="24"/>
+          <w:szCs w:val="24"/>
+        </w:rPr>
+      </w:pPr>
+      <w:r>
+        <w:rPr>
+          <w:rFonts w:ascii="Calibri" w:hAnsi="Calibri" w:cs="Calibri"/>
+          <w:sz w:val="24"/>
+          <w:szCs w:val="24"/>
+        </w:rPr>
+        <w:t xml:space="preserve">Ver 2.0 </w:t>
+      </w:r>
+    </w:p>
+    <w:p>
+      <w:pPr>
+        <w:spacing w:after="0"/>
+        <w:rPr>
+          <w:rFonts w:ascii="Calibri" w:hAnsi="Calibri" w:cs="Calibri"/>
+          <w:sz w:val="24"/>
+          <w:szCs w:val="24"/>
+        </w:rPr>
+      </w:pPr>
+      <w:r>
+        <w:rPr>
+          <w:rFonts w:ascii="Calibri" w:hAnsi="Calibri" w:cs="Calibri"/>
+          <w:sz w:val="24"/>
+          <w:szCs w:val="24"/>
+        </w:rPr>
+        <w:t>Last updated: September 29, 2026</w:t>
       </w:r>
     </w:p>
     <w:sectPr>
@@ -2477,15 +2514,7 @@
         <w:sz w:val="16"/>
         <w:szCs w:val="16"/>
       </w:rPr>
-      <w:t>2025-17873-MN-</w:t>
-    </w:r>
-    <w:r>
-      <w:rPr>
-        <w:rFonts w:ascii="Calibri" w:hAnsi="Calibri" w:cs="Calibri"/>
-        <w:sz w:val="16"/>
-        <w:szCs w:val="16"/>
-      </w:rPr>
-      <w:t>0</w:t>
+      <w:t>2025-17873-MN-0</w:t>
     </w:r>
   </w:p>
   <w:p>
@@ -3110,6 +3139,7 @@
   <w:style w:type="character" w:default="1" w:styleId="DefaultParagraphFont">
     <w:name w:val="Default Paragraph Font"/>
     <w:uiPriority w:val="1"/>
+    <w:semiHidden/>
     <w:unhideWhenUsed/>
   </w:style>
   <w:style w:type="table" w:default="1" w:styleId="TableNormal">

</xml_diff>